<commit_message>
TRIO Forecaster quī pensa Asanae vertit ad itinerāria et ūsuārium ut ea trātat admonet. Nōn prohibēre mūtātiōnēs pensōrum potest
</commit_message>
<xml_diff>
--- a/asana-iter/.itineraries/2024_2025/2024_10_October/DavisChristopher_Wk_Iter_14October2024_v1.docx
+++ b/asana-iter/.itineraries/2024_2025/2024_10_October/DavisChristopher_Wk_Iter_14October2024_v1.docx
@@ -176,143 +176,132 @@
             </w:tcBorders>
             <w:shd w:fill="EDEDED"/>
           </w:tcPr>
-          <w:p>
-            <w:pPr>
-              <w:pStyle w:val="ListParagraph"/>
-              <w:numPr>
-                <w:ilvl w:val="0"/>
-                <w:numId w:val="1"/>
-              </w:numPr>
-            </w:pPr>
-            <w:r>
-              <w:rPr>
-                <w:b/>
-                <w:bCs/>
-                <w:sz w:val="12"/>
-                <w:szCs w:val="12"/>
-                <w:strike w:val="false"/>
-                <w:rFonts w:ascii="Avenir Next LT Pro Light" w:cs="Avenir Next LT Pro Light" w:eastAsia="Avenir Next LT Pro Light" w:hAnsi="Avenir Next LT Pro Light"/>
-              </w:rPr>
-              <w:t xml:space="preserve">KANYE</w:t>
-            </w:r>
-          </w:p>
-          <w:p>
-            <w:r>
-              <w:rPr>
-                <w:sz w:val="12"/>
-                <w:szCs w:val="12"/>
-                <w:rFonts w:ascii="Avenir Next LT Pro Light" w:cs="Avenir Next LT Pro Light" w:eastAsia="Avenir Next LT Pro Light" w:hAnsi="Avenir Next LT Pro Light"/>
-              </w:rPr>
-              <w:t xml:space="preserve">Description: SCUBIDI VVP</w:t>
-            </w:r>
-          </w:p>
-          <w:p>
-            <w:r>
-              <w:t xml:space="preserve">***</w:t>
-            </w:r>
-          </w:p>
-          <w:p>
-            <w:r>
-              <w:rPr>
-                <w:sz w:val="12"/>
-                <w:szCs w:val="12"/>
-                <w:rFonts w:ascii="Avenir Next LT Pro Light" w:cs="Avenir Next LT Pro Light" w:eastAsia="Avenir Next LT Pro Light" w:hAnsi="Avenir Next LT Pro Light"/>
-              </w:rPr>
-              <w:t xml:space="preserve">Last Comment: YEEE</w:t>
-            </w:r>
-          </w:p>
           <w:p/>
-          <w:p>
-            <w:pPr>
-              <w:pStyle w:val="ListParagraph"/>
-              <w:numPr>
-                <w:ilvl w:val="0"/>
-                <w:numId w:val="1"/>
-              </w:numPr>
-            </w:pPr>
-            <w:r>
-              <w:rPr>
-                <w:b/>
-                <w:bCs/>
-                <w:sz w:val="12"/>
-                <w:szCs w:val="12"/>
-                <w:strike w:val="false"/>
-                <w:rFonts w:ascii="Avenir Next LT Pro Light" w:cs="Avenir Next LT Pro Light" w:eastAsia="Avenir Next LT Pro Light" w:hAnsi="Avenir Next LT Pro Light"/>
-              </w:rPr>
-              <w:t xml:space="preserve">YEEEEE</w:t>
-            </w:r>
-          </w:p>
-          <w:p>
-            <w:r>
-              <w:rPr>
-                <w:sz w:val="12"/>
-                <w:szCs w:val="12"/>
-                <w:rFonts w:ascii="Avenir Next LT Pro Light" w:cs="Avenir Next LT Pro Light" w:eastAsia="Avenir Next LT Pro Light" w:hAnsi="Avenir Next LT Pro Light"/>
-              </w:rPr>
-              <w:t xml:space="preserve">Description: Careo Kanye Pristinum</w:t>
-            </w:r>
-          </w:p>
-          <w:p>
-            <w:r>
-              <w:t xml:space="preserve">***</w:t>
-            </w:r>
-          </w:p>
-          <w:p>
-            <w:r>
-              <w:rPr>
-                <w:sz w:val="12"/>
-                <w:szCs w:val="12"/>
-                <w:rFonts w:ascii="Avenir Next LT Pro Light" w:cs="Avenir Next LT Pro Light" w:eastAsia="Avenir Next LT Pro Light" w:hAnsi="Avenir Next LT Pro Light"/>
-              </w:rPr>
-              <w:t xml:space="preserve">Last Comment: Christopher TRIO IT added to TRIO EOC Central AR</w:t>
-            </w:r>
-          </w:p>
+        </w:tc>
+      </w:tr>
+      <w:tr>
+        <w:tc>
+          <w:tcPr>
+            <w:tcW w:type="pct" w:w="20%"/>
+            <w:tcBorders>
+              <w:top w:val="single" w:color="A5A5A5" w:sz="5"/>
+              <w:left w:val="single" w:color="A5A5A5" w:sz="5"/>
+              <w:bottom w:val="single" w:color="A5A5A5" w:sz="5"/>
+              <w:right w:val="single" w:color="A5A5A5" w:sz="5"/>
+            </w:tcBorders>
+            <w:shd w:fill="FFFFFF"/>
+          </w:tcPr>
+          <w:p>
+            <w:r>
+              <w:rPr>
+                <w:b w:val="false"/>
+                <w:bCs w:val="false"/>
+                <w:sz w:val="30"/>
+                <w:szCs w:val="30"/>
+                <w:rFonts w:ascii="Avenir Next LT Pro Light" w:cs="Avenir Next LT Pro Light" w:eastAsia="Avenir Next LT Pro Light" w:hAnsi="Avenir Next LT Pro Light"/>
+              </w:rPr>
+              <w:t xml:space="preserve">Tuesday</w:t>
+            </w:r>
+          </w:p>
+        </w:tc>
+        <w:tc>
+          <w:tcPr>
+            <w:tcW w:type="pct" w:w="20%"/>
+            <w:tcBorders>
+              <w:top w:val="single" w:color="A5A5A5" w:sz="5"/>
+              <w:left w:val="single" w:color="A5A5A5" w:sz="5"/>
+              <w:bottom w:val="single" w:color="A5A5A5" w:sz="5"/>
+              <w:right w:val="single" w:color="A5A5A5" w:sz="5"/>
+            </w:tcBorders>
+            <w:shd w:fill="FFFFFF"/>
+          </w:tcPr>
+          <w:p>
+            <w:r>
+              <w:rPr>
+                <w:b w:val="false"/>
+                <w:bCs w:val="false"/>
+                <w:sz w:val="30"/>
+                <w:szCs w:val="30"/>
+                <w:rFonts w:ascii="Avenir Next LT Pro Light" w:cs="Avenir Next LT Pro Light" w:eastAsia="Avenir Next LT Pro Light" w:hAnsi="Avenir Next LT Pro Light"/>
+              </w:rPr>
+              <w:t xml:space="preserve">15 October 2024</w:t>
+            </w:r>
+          </w:p>
+        </w:tc>
+        <w:tc>
+          <w:tcPr>
+            <w:tcW w:type="pct" w:w="60%"/>
+            <w:tcBorders>
+              <w:top w:val="single" w:color="A5A5A5" w:sz="5"/>
+              <w:left w:val="single" w:color="A5A5A5" w:sz="5"/>
+              <w:bottom w:val="single" w:color="A5A5A5" w:sz="5"/>
+              <w:right w:val="single" w:color="A5A5A5" w:sz="5"/>
+            </w:tcBorders>
+            <w:shd w:fill="FFFFFF"/>
+          </w:tcPr>
           <w:p/>
-          <w:p>
-            <w:pPr>
-              <w:pStyle w:val="ListParagraph"/>
-              <w:numPr>
-                <w:ilvl w:val="0"/>
-                <w:numId w:val="1"/>
-              </w:numPr>
-            </w:pPr>
-            <w:r>
-              <w:rPr>
-                <w:b/>
-                <w:bCs/>
-                <w:sz w:val="12"/>
-                <w:szCs w:val="12"/>
-                <w:strike w:val="false"/>
-                <w:rFonts w:ascii="Avenir Next LT Pro Light" w:cs="Avenir Next LT Pro Light" w:eastAsia="Avenir Next LT Pro Light" w:hAnsi="Avenir Next LT Pro Light"/>
-              </w:rPr>
-              <w:t xml:space="preserve">sofiamongroy</w:t>
-            </w:r>
-          </w:p>
-          <w:p>
-            <w:r>
-              <w:rPr>
-                <w:sz w:val="12"/>
-                <w:szCs w:val="12"/>
-                <w:rFonts w:ascii="Avenir Next LT Pro Light" w:cs="Avenir Next LT Pro Light" w:eastAsia="Avenir Next LT Pro Light" w:hAnsi="Avenir Next LT Pro Light"/>
-              </w:rPr>
-              <w:t xml:space="preserve">Description: </w:t>
-            </w:r>
-          </w:p>
-          <w:p>
-            <w:r>
-              <w:t xml:space="preserve">***</w:t>
-            </w:r>
-          </w:p>
-          <w:p>
-            <w:r>
-              <w:rPr>
-                <w:sz w:val="12"/>
-                <w:szCs w:val="12"/>
-                <w:rFonts w:ascii="Avenir Next LT Pro Light" w:cs="Avenir Next LT Pro Light" w:eastAsia="Avenir Next LT Pro Light" w:hAnsi="Avenir Next LT Pro Light"/>
-              </w:rPr>
-              <w:t xml:space="preserve">Last Comment: Christopher TRIO IT added to TRIO EOC Central AR</w:t>
-            </w:r>
-          </w:p>
+        </w:tc>
+      </w:tr>
+      <w:tr>
+        <w:tc>
+          <w:tcPr>
+            <w:tcW w:type="pct" w:w="20%"/>
+            <w:tcBorders>
+              <w:top w:val="single" w:color="A5A5A5" w:sz="5"/>
+              <w:left w:val="single" w:color="A5A5A5" w:sz="5"/>
+              <w:bottom w:val="single" w:color="A5A5A5" w:sz="5"/>
+              <w:right w:val="single" w:color="A5A5A5" w:sz="5"/>
+            </w:tcBorders>
+            <w:shd w:fill="EDEDED"/>
+          </w:tcPr>
+          <w:p>
+            <w:r>
+              <w:rPr>
+                <w:b w:val="false"/>
+                <w:bCs w:val="false"/>
+                <w:sz w:val="30"/>
+                <w:szCs w:val="30"/>
+                <w:rFonts w:ascii="Avenir Next LT Pro Light" w:cs="Avenir Next LT Pro Light" w:eastAsia="Avenir Next LT Pro Light" w:hAnsi="Avenir Next LT Pro Light"/>
+              </w:rPr>
+              <w:t xml:space="preserve">Wednesday</w:t>
+            </w:r>
+          </w:p>
+        </w:tc>
+        <w:tc>
+          <w:tcPr>
+            <w:tcW w:type="pct" w:w="20%"/>
+            <w:tcBorders>
+              <w:top w:val="single" w:color="A5A5A5" w:sz="5"/>
+              <w:left w:val="single" w:color="A5A5A5" w:sz="5"/>
+              <w:bottom w:val="single" w:color="A5A5A5" w:sz="5"/>
+              <w:right w:val="single" w:color="A5A5A5" w:sz="5"/>
+            </w:tcBorders>
+            <w:shd w:fill="EDEDED"/>
+          </w:tcPr>
+          <w:p>
+            <w:r>
+              <w:rPr>
+                <w:b w:val="false"/>
+                <w:bCs w:val="false"/>
+                <w:sz w:val="30"/>
+                <w:szCs w:val="30"/>
+                <w:rFonts w:ascii="Avenir Next LT Pro Light" w:cs="Avenir Next LT Pro Light" w:eastAsia="Avenir Next LT Pro Light" w:hAnsi="Avenir Next LT Pro Light"/>
+              </w:rPr>
+              <w:t xml:space="preserve">16 October 2024</w:t>
+            </w:r>
+          </w:p>
+        </w:tc>
+        <w:tc>
+          <w:tcPr>
+            <w:tcW w:type="pct" w:w="60%"/>
+            <w:tcBorders>
+              <w:top w:val="single" w:color="A5A5A5" w:sz="5"/>
+              <w:left w:val="single" w:color="A5A5A5" w:sz="5"/>
+              <w:bottom w:val="single" w:color="A5A5A5" w:sz="5"/>
+              <w:right w:val="single" w:color="A5A5A5" w:sz="5"/>
+            </w:tcBorders>
+            <w:shd w:fill="EDEDED"/>
+          </w:tcPr>
           <w:p/>
         </w:tc>
       </w:tr>
@@ -337,7 +326,7 @@
                 <w:szCs w:val="30"/>
                 <w:rFonts w:ascii="Avenir Next LT Pro Light" w:cs="Avenir Next LT Pro Light" w:eastAsia="Avenir Next LT Pro Light" w:hAnsi="Avenir Next LT Pro Light"/>
               </w:rPr>
-              <w:t xml:space="preserve">Tuesday</w:t>
+              <w:t xml:space="preserve">Thursday</w:t>
             </w:r>
           </w:p>
         </w:tc>
@@ -361,7 +350,7 @@
                 <w:szCs w:val="30"/>
                 <w:rFonts w:ascii="Avenir Next LT Pro Light" w:cs="Avenir Next LT Pro Light" w:eastAsia="Avenir Next LT Pro Light" w:hAnsi="Avenir Next LT Pro Light"/>
               </w:rPr>
-              <w:t xml:space="preserve">15 October 2024</w:t>
+              <w:t xml:space="preserve">17 October 2024</w:t>
             </w:r>
           </w:p>
         </w:tc>
@@ -376,682 +365,6 @@
             </w:tcBorders>
             <w:shd w:fill="FFFFFF"/>
           </w:tcPr>
-          <w:p>
-            <w:pPr>
-              <w:pStyle w:val="ListParagraph"/>
-              <w:numPr>
-                <w:ilvl w:val="0"/>
-                <w:numId w:val="1"/>
-              </w:numPr>
-            </w:pPr>
-            <w:r>
-              <w:rPr>
-                <w:b/>
-                <w:bCs/>
-                <w:sz w:val="12"/>
-                <w:szCs w:val="12"/>
-                <w:strike w:val="false"/>
-                <w:rFonts w:ascii="Avenir Next LT Pro Light" w:cs="Avenir Next LT Pro Light" w:eastAsia="Avenir Next LT Pro Light" w:hAnsi="Avenir Next LT Pro Light"/>
-              </w:rPr>
-              <w:t xml:space="preserve">RECTISSIME</w:t>
-            </w:r>
-          </w:p>
-          <w:p>
-            <w:r>
-              <w:rPr>
-                <w:sz w:val="12"/>
-                <w:szCs w:val="12"/>
-                <w:rFonts w:ascii="Avenir Next LT Pro Light" w:cs="Avenir Next LT Pro Light" w:eastAsia="Avenir Next LT Pro Light" w:hAnsi="Avenir Next LT Pro Light"/>
-              </w:rPr>
-              <w:t xml:space="preserve">Description: </w:t>
-            </w:r>
-          </w:p>
-          <w:p>
-            <w:r>
-              <w:t xml:space="preserve">***</w:t>
-            </w:r>
-          </w:p>
-          <w:p>
-            <w:r>
-              <w:rPr>
-                <w:sz w:val="12"/>
-                <w:szCs w:val="12"/>
-                <w:rFonts w:ascii="Avenir Next LT Pro Light" w:cs="Avenir Next LT Pro Light" w:eastAsia="Avenir Next LT Pro Light" w:hAnsi="Avenir Next LT Pro Light"/>
-              </w:rPr>
-              <w:t xml:space="preserve">Last Comment: Christopher TRIO IT added to TRIO EOC Central AR</w:t>
-            </w:r>
-          </w:p>
-          <w:p/>
-          <w:p>
-            <w:pPr>
-              <w:pStyle w:val="ListParagraph"/>
-              <w:numPr>
-                <w:ilvl w:val="0"/>
-                <w:numId w:val="1"/>
-              </w:numPr>
-            </w:pPr>
-            <w:r>
-              <w:rPr>
-                <w:b/>
-                <w:bCs/>
-                <w:sz w:val="12"/>
-                <w:szCs w:val="12"/>
-                <w:strike w:val="false"/>
-                <w:rFonts w:ascii="Avenir Next LT Pro Light" w:cs="Avenir Next LT Pro Light" w:eastAsia="Avenir Next LT Pro Light" w:hAnsi="Avenir Next LT Pro Light"/>
-              </w:rPr>
-              <w:t xml:space="preserve">RECTE</w:t>
-            </w:r>
-          </w:p>
-          <w:p>
-            <w:r>
-              <w:rPr>
-                <w:sz w:val="12"/>
-                <w:szCs w:val="12"/>
-                <w:rFonts w:ascii="Avenir Next LT Pro Light" w:cs="Avenir Next LT Pro Light" w:eastAsia="Avenir Next LT Pro Light" w:hAnsi="Avenir Next LT Pro Light"/>
-              </w:rPr>
-              <w:t xml:space="preserve">Description: </w:t>
-            </w:r>
-          </w:p>
-          <w:p>
-            <w:r>
-              <w:t xml:space="preserve">***</w:t>
-            </w:r>
-          </w:p>
-          <w:p>
-            <w:r>
-              <w:rPr>
-                <w:sz w:val="12"/>
-                <w:szCs w:val="12"/>
-                <w:rFonts w:ascii="Avenir Next LT Pro Light" w:cs="Avenir Next LT Pro Light" w:eastAsia="Avenir Next LT Pro Light" w:hAnsi="Avenir Next LT Pro Light"/>
-              </w:rPr>
-              <w:t xml:space="preserve">Last Comment: Christopher TRIO IT added to TRIO EOC Central AR</w:t>
-            </w:r>
-          </w:p>
-          <w:p/>
-          <w:p>
-            <w:pPr>
-              <w:pStyle w:val="ListParagraph"/>
-              <w:numPr>
-                <w:ilvl w:val="0"/>
-                <w:numId w:val="1"/>
-              </w:numPr>
-            </w:pPr>
-            <w:r>
-              <w:rPr>
-                <w:b/>
-                <w:bCs/>
-                <w:sz w:val="12"/>
-                <w:szCs w:val="12"/>
-                <w:strike w:val="false"/>
-                <w:rFonts w:ascii="Avenir Next LT Pro Light" w:cs="Avenir Next LT Pro Light" w:eastAsia="Avenir Next LT Pro Light" w:hAnsi="Avenir Next LT Pro Light"/>
-              </w:rPr>
-              <w:t xml:space="preserve">PROXIMM</w:t>
-            </w:r>
-          </w:p>
-          <w:p>
-            <w:r>
-              <w:rPr>
-                <w:sz w:val="12"/>
-                <w:szCs w:val="12"/>
-                <w:rFonts w:ascii="Avenir Next LT Pro Light" w:cs="Avenir Next LT Pro Light" w:eastAsia="Avenir Next LT Pro Light" w:hAnsi="Avenir Next LT Pro Light"/>
-              </w:rPr>
-              <w:t xml:space="preserve">Description: </w:t>
-            </w:r>
-          </w:p>
-          <w:p>
-            <w:r>
-              <w:t xml:space="preserve">***</w:t>
-            </w:r>
-          </w:p>
-          <w:p>
-            <w:r>
-              <w:rPr>
-                <w:sz w:val="12"/>
-                <w:szCs w:val="12"/>
-                <w:rFonts w:ascii="Avenir Next LT Pro Light" w:cs="Avenir Next LT Pro Light" w:eastAsia="Avenir Next LT Pro Light" w:hAnsi="Avenir Next LT Pro Light"/>
-              </w:rPr>
-              <w:t xml:space="preserve">Last Comment: Christopher TRIO IT added to TRIO EOC Central AR</w:t>
-            </w:r>
-          </w:p>
-          <w:p/>
-          <w:p>
-            <w:pPr>
-              <w:pStyle w:val="ListParagraph"/>
-              <w:numPr>
-                <w:ilvl w:val="0"/>
-                <w:numId w:val="1"/>
-              </w:numPr>
-            </w:pPr>
-            <w:r>
-              <w:rPr>
-                <w:b/>
-                <w:bCs/>
-                <w:sz w:val="12"/>
-                <w:szCs w:val="12"/>
-                <w:strike w:val="false"/>
-                <w:rFonts w:ascii="Avenir Next LT Pro Light" w:cs="Avenir Next LT Pro Light" w:eastAsia="Avenir Next LT Pro Light" w:hAnsi="Avenir Next LT Pro Light"/>
-              </w:rPr>
-              <w:t xml:space="preserve">thispateat</w:t>
-            </w:r>
-          </w:p>
-          <w:p>
-            <w:r>
-              <w:rPr>
-                <w:sz w:val="12"/>
-                <w:szCs w:val="12"/>
-                <w:rFonts w:ascii="Avenir Next LT Pro Light" w:cs="Avenir Next LT Pro Light" w:eastAsia="Avenir Next LT Pro Light" w:hAnsi="Avenir Next LT Pro Light"/>
-              </w:rPr>
-              <w:t xml:space="preserve">Description: </w:t>
-            </w:r>
-          </w:p>
-          <w:p>
-            <w:r>
-              <w:t xml:space="preserve">***</w:t>
-            </w:r>
-          </w:p>
-          <w:p>
-            <w:r>
-              <w:rPr>
-                <w:sz w:val="12"/>
-                <w:szCs w:val="12"/>
-                <w:rFonts w:ascii="Avenir Next LT Pro Light" w:cs="Avenir Next LT Pro Light" w:eastAsia="Avenir Next LT Pro Light" w:hAnsi="Avenir Next LT Pro Light"/>
-              </w:rPr>
-              <w:t xml:space="preserve">Last Comment: Christopher TRIO IT added to TRIO EOC Central AR</w:t>
-            </w:r>
-          </w:p>
-          <w:p/>
-          <w:p>
-            <w:pPr>
-              <w:pStyle w:val="ListParagraph"/>
-              <w:numPr>
-                <w:ilvl w:val="0"/>
-                <w:numId w:val="1"/>
-              </w:numPr>
-            </w:pPr>
-            <w:r>
-              <w:rPr>
-                <w:b/>
-                <w:bCs/>
-                <w:sz w:val="12"/>
-                <w:szCs w:val="12"/>
-                <w:strike w:val="false"/>
-                <w:rFonts w:ascii="Avenir Next LT Pro Light" w:cs="Avenir Next LT Pro Light" w:eastAsia="Avenir Next LT Pro Light" w:hAnsi="Avenir Next LT Pro Light"/>
-              </w:rPr>
-              <w:t xml:space="preserve">YES</w:t>
-            </w:r>
-          </w:p>
-          <w:p>
-            <w:r>
-              <w:rPr>
-                <w:sz w:val="12"/>
-                <w:szCs w:val="12"/>
-                <w:rFonts w:ascii="Avenir Next LT Pro Light" w:cs="Avenir Next LT Pro Light" w:eastAsia="Avenir Next LT Pro Light" w:hAnsi="Avenir Next LT Pro Light"/>
-              </w:rPr>
-              <w:t xml:space="preserve">Description: </w:t>
-            </w:r>
-          </w:p>
-          <w:p>
-            <w:r>
-              <w:t xml:space="preserve">***</w:t>
-            </w:r>
-          </w:p>
-          <w:p>
-            <w:r>
-              <w:rPr>
-                <w:sz w:val="12"/>
-                <w:szCs w:val="12"/>
-                <w:rFonts w:ascii="Avenir Next LT Pro Light" w:cs="Avenir Next LT Pro Light" w:eastAsia="Avenir Next LT Pro Light" w:hAnsi="Avenir Next LT Pro Light"/>
-              </w:rPr>
-              <w:t xml:space="preserve">Last Comment: Christopher TRIO IT added to TRIO EOC Central AR</w:t>
-            </w:r>
-          </w:p>
-          <w:p/>
-          <w:p>
-            <w:pPr>
-              <w:pStyle w:val="ListParagraph"/>
-              <w:numPr>
-                <w:ilvl w:val="0"/>
-                <w:numId w:val="1"/>
-              </w:numPr>
-            </w:pPr>
-            <w:r>
-              <w:rPr>
-                <w:b/>
-                <w:bCs/>
-                <w:sz w:val="12"/>
-                <w:szCs w:val="12"/>
-                <w:strike w:val="false"/>
-                <w:rFonts w:ascii="Avenir Next LT Pro Light" w:cs="Avenir Next LT Pro Light" w:eastAsia="Avenir Next LT Pro Light" w:hAnsi="Avenir Next LT Pro Light"/>
-              </w:rPr>
-              <w:t xml:space="preserve">PROXIMA</w:t>
-            </w:r>
-          </w:p>
-          <w:p>
-            <w:r>
-              <w:rPr>
-                <w:sz w:val="12"/>
-                <w:szCs w:val="12"/>
-                <w:rFonts w:ascii="Avenir Next LT Pro Light" w:cs="Avenir Next LT Pro Light" w:eastAsia="Avenir Next LT Pro Light" w:hAnsi="Avenir Next LT Pro Light"/>
-              </w:rPr>
-              <w:t xml:space="preserve">Description: </w:t>
-            </w:r>
-          </w:p>
-          <w:p>
-            <w:r>
-              <w:t xml:space="preserve">***</w:t>
-            </w:r>
-          </w:p>
-          <w:p>
-            <w:r>
-              <w:rPr>
-                <w:sz w:val="12"/>
-                <w:szCs w:val="12"/>
-                <w:rFonts w:ascii="Avenir Next LT Pro Light" w:cs="Avenir Next LT Pro Light" w:eastAsia="Avenir Next LT Pro Light" w:hAnsi="Avenir Next LT Pro Light"/>
-              </w:rPr>
-              <w:t xml:space="preserve">Last Comment: Christopher TRIO IT added to TRIO EOC Central AR</w:t>
-            </w:r>
-          </w:p>
-          <w:p/>
-        </w:tc>
-      </w:tr>
-      <w:tr>
-        <w:tc>
-          <w:tcPr>
-            <w:tcW w:type="pct" w:w="20%"/>
-            <w:tcBorders>
-              <w:top w:val="single" w:color="A5A5A5" w:sz="5"/>
-              <w:left w:val="single" w:color="A5A5A5" w:sz="5"/>
-              <w:bottom w:val="single" w:color="A5A5A5" w:sz="5"/>
-              <w:right w:val="single" w:color="A5A5A5" w:sz="5"/>
-            </w:tcBorders>
-            <w:shd w:fill="EDEDED"/>
-          </w:tcPr>
-          <w:p>
-            <w:r>
-              <w:rPr>
-                <w:b w:val="false"/>
-                <w:bCs w:val="false"/>
-                <w:sz w:val="30"/>
-                <w:szCs w:val="30"/>
-                <w:rFonts w:ascii="Avenir Next LT Pro Light" w:cs="Avenir Next LT Pro Light" w:eastAsia="Avenir Next LT Pro Light" w:hAnsi="Avenir Next LT Pro Light"/>
-              </w:rPr>
-              <w:t xml:space="preserve">Wednesday</w:t>
-            </w:r>
-          </w:p>
-        </w:tc>
-        <w:tc>
-          <w:tcPr>
-            <w:tcW w:type="pct" w:w="20%"/>
-            <w:tcBorders>
-              <w:top w:val="single" w:color="A5A5A5" w:sz="5"/>
-              <w:left w:val="single" w:color="A5A5A5" w:sz="5"/>
-              <w:bottom w:val="single" w:color="A5A5A5" w:sz="5"/>
-              <w:right w:val="single" w:color="A5A5A5" w:sz="5"/>
-            </w:tcBorders>
-            <w:shd w:fill="EDEDED"/>
-          </w:tcPr>
-          <w:p>
-            <w:r>
-              <w:rPr>
-                <w:b w:val="false"/>
-                <w:bCs w:val="false"/>
-                <w:sz w:val="30"/>
-                <w:szCs w:val="30"/>
-                <w:rFonts w:ascii="Avenir Next LT Pro Light" w:cs="Avenir Next LT Pro Light" w:eastAsia="Avenir Next LT Pro Light" w:hAnsi="Avenir Next LT Pro Light"/>
-              </w:rPr>
-              <w:t xml:space="preserve">16 October 2024</w:t>
-            </w:r>
-          </w:p>
-        </w:tc>
-        <w:tc>
-          <w:tcPr>
-            <w:tcW w:type="pct" w:w="60%"/>
-            <w:tcBorders>
-              <w:top w:val="single" w:color="A5A5A5" w:sz="5"/>
-              <w:left w:val="single" w:color="A5A5A5" w:sz="5"/>
-              <w:bottom w:val="single" w:color="A5A5A5" w:sz="5"/>
-              <w:right w:val="single" w:color="A5A5A5" w:sz="5"/>
-            </w:tcBorders>
-            <w:shd w:fill="EDEDED"/>
-          </w:tcPr>
-          <w:p>
-            <w:pPr>
-              <w:pStyle w:val="ListParagraph"/>
-              <w:numPr>
-                <w:ilvl w:val="0"/>
-                <w:numId w:val="1"/>
-              </w:numPr>
-            </w:pPr>
-            <w:r>
-              <w:rPr>
-                <w:b/>
-                <w:bCs/>
-                <w:sz w:val="12"/>
-                <w:szCs w:val="12"/>
-                <w:strike w:val="false"/>
-                <w:rFonts w:ascii="Avenir Next LT Pro Light" w:cs="Avenir Next LT Pro Light" w:eastAsia="Avenir Next LT Pro Light" w:hAnsi="Avenir Next LT Pro Light"/>
-              </w:rPr>
-              <w:t xml:space="preserve">Comer</w:t>
-            </w:r>
-          </w:p>
-          <w:p>
-            <w:r>
-              <w:rPr>
-                <w:sz w:val="12"/>
-                <w:szCs w:val="12"/>
-                <w:rFonts w:ascii="Avenir Next LT Pro Light" w:cs="Avenir Next LT Pro Light" w:eastAsia="Avenir Next LT Pro Light" w:hAnsi="Avenir Next LT Pro Light"/>
-              </w:rPr>
-              <w:t xml:space="preserve">Description: Pollo con verduras</w:t>
-            </w:r>
-          </w:p>
-          <w:p>
-            <w:r>
-              <w:t xml:space="preserve">***</w:t>
-            </w:r>
-          </w:p>
-          <w:p>
-            <w:r>
-              <w:rPr>
-                <w:sz w:val="12"/>
-                <w:szCs w:val="12"/>
-                <w:rFonts w:ascii="Avenir Next LT Pro Light" w:cs="Avenir Next LT Pro Light" w:eastAsia="Avenir Next LT Pro Light" w:hAnsi="Avenir Next LT Pro Light"/>
-              </w:rPr>
-              <w:t xml:space="preserve">Last Comment: Christopher TRIO IT added to TRIO EOC Central AR</w:t>
-            </w:r>
-          </w:p>
-          <w:p/>
-          <w:p>
-            <w:pPr>
-              <w:pStyle w:val="ListParagraph"/>
-              <w:numPr>
-                <w:ilvl w:val="0"/>
-                <w:numId w:val="1"/>
-              </w:numPr>
-            </w:pPr>
-            <w:r>
-              <w:rPr>
-                <w:b/>
-                <w:bCs/>
-                <w:sz w:val="12"/>
-                <w:szCs w:val="12"/>
-                <w:strike w:val="false"/>
-                <w:rFonts w:ascii="Avenir Next LT Pro Light" w:cs="Avenir Next LT Pro Light" w:eastAsia="Avenir Next LT Pro Light" w:hAnsi="Avenir Next LT Pro Light"/>
-              </w:rPr>
-              <w:t xml:space="preserve">Look at the Binder</w:t>
-            </w:r>
-          </w:p>
-          <w:p>
-            <w:r>
-              <w:rPr>
-                <w:sz w:val="12"/>
-                <w:szCs w:val="12"/>
-                <w:rFonts w:ascii="Avenir Next LT Pro Light" w:cs="Avenir Next LT Pro Light" w:eastAsia="Avenir Next LT Pro Light" w:hAnsi="Avenir Next LT Pro Light"/>
-              </w:rPr>
-              <w:t xml:space="preserve">Description: Look at the binder in the front desk</w:t>
-            </w:r>
-          </w:p>
-          <w:p>
-            <w:r>
-              <w:t xml:space="preserve">***</w:t>
-            </w:r>
-          </w:p>
-          <w:p>
-            <w:r>
-              <w:rPr>
-                <w:sz w:val="12"/>
-                <w:szCs w:val="12"/>
-                <w:rFonts w:ascii="Avenir Next LT Pro Light" w:cs="Avenir Next LT Pro Light" w:eastAsia="Avenir Next LT Pro Light" w:hAnsi="Avenir Next LT Pro Light"/>
-              </w:rPr>
-              <w:t xml:space="preserve">Last Comment: Christopher TRIO IT added to TRIO EOC Central AR</w:t>
-            </w:r>
-          </w:p>
-          <w:p/>
-          <w:p>
-            <w:pPr>
-              <w:pStyle w:val="ListParagraph"/>
-              <w:numPr>
-                <w:ilvl w:val="0"/>
-                <w:numId w:val="1"/>
-              </w:numPr>
-            </w:pPr>
-            <w:r>
-              <w:rPr>
-                <w:b/>
-                <w:bCs/>
-                <w:sz w:val="12"/>
-                <w:szCs w:val="12"/>
-                <w:strike w:val="false"/>
-                <w:rFonts w:ascii="Avenir Next LT Pro Light" w:cs="Avenir Next LT Pro Light" w:eastAsia="Avenir Next LT Pro Light" w:hAnsi="Avenir Next LT Pro Light"/>
-              </w:rPr>
-              <w:t xml:space="preserve">Go get mail</w:t>
-            </w:r>
-          </w:p>
-          <w:p>
-            <w:r>
-              <w:rPr>
-                <w:sz w:val="12"/>
-                <w:szCs w:val="12"/>
-                <w:rFonts w:ascii="Avenir Next LT Pro Light" w:cs="Avenir Next LT Pro Light" w:eastAsia="Avenir Next LT Pro Light" w:hAnsi="Avenir Next LT Pro Light"/>
-              </w:rPr>
-              <w:t xml:space="preserve">Description: Go get mail at 2 pm</w:t>
-            </w:r>
-          </w:p>
-          <w:p>
-            <w:r>
-              <w:t xml:space="preserve">***</w:t>
-            </w:r>
-          </w:p>
-          <w:p>
-            <w:r>
-              <w:rPr>
-                <w:sz w:val="12"/>
-                <w:szCs w:val="12"/>
-                <w:rFonts w:ascii="Avenir Next LT Pro Light" w:cs="Avenir Next LT Pro Light" w:eastAsia="Avenir Next LT Pro Light" w:hAnsi="Avenir Next LT Pro Light"/>
-              </w:rPr>
-              <w:t xml:space="preserve">Last Comment: Christopher TRIO IT added to TRIO EOC Central AR</w:t>
-            </w:r>
-          </w:p>
-          <w:p/>
-        </w:tc>
-      </w:tr>
-      <w:tr>
-        <w:tc>
-          <w:tcPr>
-            <w:tcW w:type="pct" w:w="20%"/>
-            <w:tcBorders>
-              <w:top w:val="single" w:color="A5A5A5" w:sz="5"/>
-              <w:left w:val="single" w:color="A5A5A5" w:sz="5"/>
-              <w:bottom w:val="single" w:color="A5A5A5" w:sz="5"/>
-              <w:right w:val="single" w:color="A5A5A5" w:sz="5"/>
-            </w:tcBorders>
-            <w:shd w:fill="FFFFFF"/>
-          </w:tcPr>
-          <w:p>
-            <w:r>
-              <w:rPr>
-                <w:b w:val="false"/>
-                <w:bCs w:val="false"/>
-                <w:sz w:val="30"/>
-                <w:szCs w:val="30"/>
-                <w:rFonts w:ascii="Avenir Next LT Pro Light" w:cs="Avenir Next LT Pro Light" w:eastAsia="Avenir Next LT Pro Light" w:hAnsi="Avenir Next LT Pro Light"/>
-              </w:rPr>
-              <w:t xml:space="preserve">Thursday</w:t>
-            </w:r>
-          </w:p>
-        </w:tc>
-        <w:tc>
-          <w:tcPr>
-            <w:tcW w:type="pct" w:w="20%"/>
-            <w:tcBorders>
-              <w:top w:val="single" w:color="A5A5A5" w:sz="5"/>
-              <w:left w:val="single" w:color="A5A5A5" w:sz="5"/>
-              <w:bottom w:val="single" w:color="A5A5A5" w:sz="5"/>
-              <w:right w:val="single" w:color="A5A5A5" w:sz="5"/>
-            </w:tcBorders>
-            <w:shd w:fill="FFFFFF"/>
-          </w:tcPr>
-          <w:p>
-            <w:r>
-              <w:rPr>
-                <w:b w:val="false"/>
-                <w:bCs w:val="false"/>
-                <w:sz w:val="30"/>
-                <w:szCs w:val="30"/>
-                <w:rFonts w:ascii="Avenir Next LT Pro Light" w:cs="Avenir Next LT Pro Light" w:eastAsia="Avenir Next LT Pro Light" w:hAnsi="Avenir Next LT Pro Light"/>
-              </w:rPr>
-              <w:t xml:space="preserve">17 October 2024</w:t>
-            </w:r>
-          </w:p>
-        </w:tc>
-        <w:tc>
-          <w:tcPr>
-            <w:tcW w:type="pct" w:w="60%"/>
-            <w:tcBorders>
-              <w:top w:val="single" w:color="A5A5A5" w:sz="5"/>
-              <w:left w:val="single" w:color="A5A5A5" w:sz="5"/>
-              <w:bottom w:val="single" w:color="A5A5A5" w:sz="5"/>
-              <w:right w:val="single" w:color="A5A5A5" w:sz="5"/>
-            </w:tcBorders>
-            <w:shd w:fill="FFFFFF"/>
-          </w:tcPr>
-          <w:p>
-            <w:pPr>
-              <w:pStyle w:val="ListParagraph"/>
-              <w:numPr>
-                <w:ilvl w:val="0"/>
-                <w:numId w:val="1"/>
-              </w:numPr>
-            </w:pPr>
-            <w:r>
-              <w:rPr>
-                <w:b/>
-                <w:bCs/>
-                <w:sz w:val="12"/>
-                <w:szCs w:val="12"/>
-                <w:strike/>
-                <w:rFonts w:ascii="Avenir Next LT Pro Light" w:cs="Avenir Next LT Pro Light" w:eastAsia="Avenir Next LT Pro Light" w:hAnsi="Avenir Next LT Pro Light"/>
-              </w:rPr>
-              <w:t xml:space="preserve">Check email</w:t>
-            </w:r>
-          </w:p>
-          <w:p>
-            <w:r>
-              <w:rPr>
-                <w:sz w:val="12"/>
-                <w:szCs w:val="12"/>
-                <w:rFonts w:ascii="Avenir Next LT Pro Light" w:cs="Avenir Next LT Pro Light" w:eastAsia="Avenir Next LT Pro Light" w:hAnsi="Avenir Next LT Pro Light"/>
-              </w:rPr>
-              <w:t xml:space="preserve">Description: Confirming future presentation dates
-Announcements for upcoming community events</w:t>
-            </w:r>
-          </w:p>
-          <w:p>
-            <w:r>
-              <w:t xml:space="preserve">***</w:t>
-            </w:r>
-          </w:p>
-          <w:p>
-            <w:r>
-              <w:rPr>
-                <w:sz w:val="12"/>
-                <w:szCs w:val="12"/>
-                <w:rFonts w:ascii="Avenir Next LT Pro Light" w:cs="Avenir Next LT Pro Light" w:eastAsia="Avenir Next LT Pro Light" w:hAnsi="Avenir Next LT Pro Light"/>
-              </w:rPr>
-              <w:t xml:space="preserve">Last Comment: Christopher TRIO IT marked this task complete</w:t>
-            </w:r>
-          </w:p>
-          <w:p/>
-          <w:p>
-            <w:pPr>
-              <w:pStyle w:val="ListParagraph"/>
-              <w:numPr>
-                <w:ilvl w:val="0"/>
-                <w:numId w:val="1"/>
-              </w:numPr>
-            </w:pPr>
-            <w:r>
-              <w:rPr>
-                <w:b/>
-                <w:bCs/>
-                <w:sz w:val="12"/>
-                <w:szCs w:val="12"/>
-                <w:strike/>
-                <w:rFonts w:ascii="Avenir Next LT Pro Light" w:cs="Avenir Next LT Pro Light" w:eastAsia="Avenir Next LT Pro Light" w:hAnsi="Avenir Next LT Pro Light"/>
-              </w:rPr>
-              <w:t xml:space="preserve">Follow up on Phone calls</w:t>
-            </w:r>
-          </w:p>
-          <w:p>
-            <w:r>
-              <w:rPr>
-                <w:sz w:val="12"/>
-                <w:szCs w:val="12"/>
-                <w:rFonts w:ascii="Avenir Next LT Pro Light" w:cs="Avenir Next LT Pro Light" w:eastAsia="Avenir Next LT Pro Light" w:hAnsi="Avenir Next LT Pro Light"/>
-              </w:rPr>
-              <w:t xml:space="preserve">Description: Returning voice messages</w:t>
-            </w:r>
-          </w:p>
-          <w:p>
-            <w:r>
-              <w:t xml:space="preserve">***</w:t>
-            </w:r>
-          </w:p>
-          <w:p>
-            <w:r>
-              <w:rPr>
-                <w:sz w:val="12"/>
-                <w:szCs w:val="12"/>
-                <w:rFonts w:ascii="Avenir Next LT Pro Light" w:cs="Avenir Next LT Pro Light" w:eastAsia="Avenir Next LT Pro Light" w:hAnsi="Avenir Next LT Pro Light"/>
-              </w:rPr>
-              <w:t xml:space="preserve">Last Comment: Christopher TRIO IT marked this task complete</w:t>
-            </w:r>
-          </w:p>
-          <w:p/>
-          <w:p>
-            <w:pPr>
-              <w:pStyle w:val="ListParagraph"/>
-              <w:numPr>
-                <w:ilvl w:val="0"/>
-                <w:numId w:val="1"/>
-              </w:numPr>
-            </w:pPr>
-            <w:r>
-              <w:rPr>
-                <w:b/>
-                <w:bCs/>
-                <w:sz w:val="12"/>
-                <w:szCs w:val="12"/>
-                <w:strike/>
-                <w:rFonts w:ascii="Avenir Next LT Pro Light" w:cs="Avenir Next LT Pro Light" w:eastAsia="Avenir Next LT Pro Light" w:hAnsi="Avenir Next LT Pro Light"/>
-              </w:rPr>
-              <w:t xml:space="preserve">update Blumen</w:t>
-            </w:r>
-          </w:p>
-          <w:p>
-            <w:r>
-              <w:rPr>
-                <w:sz w:val="12"/>
-                <w:szCs w:val="12"/>
-                <w:rFonts w:ascii="Avenir Next LT Pro Light" w:cs="Avenir Next LT Pro Light" w:eastAsia="Avenir Next LT Pro Light" w:hAnsi="Avenir Next LT Pro Light"/>
-              </w:rPr>
-              <w:t xml:space="preserve">Description: Updating contacts and putting in new applications for the student file folders</w:t>
-            </w:r>
-          </w:p>
-          <w:p>
-            <w:r>
-              <w:t xml:space="preserve">***</w:t>
-            </w:r>
-          </w:p>
-          <w:p>
-            <w:r>
-              <w:rPr>
-                <w:sz w:val="12"/>
-                <w:szCs w:val="12"/>
-                <w:rFonts w:ascii="Avenir Next LT Pro Light" w:cs="Avenir Next LT Pro Light" w:eastAsia="Avenir Next LT Pro Light" w:hAnsi="Avenir Next LT Pro Light"/>
-              </w:rPr>
-              <w:t xml:space="preserve">Last Comment: Christopher TRIO IT marked this task complete</w:t>
-            </w:r>
-          </w:p>
           <w:p/>
         </w:tc>
       </w:tr>

</xml_diff>